<commit_message>
Reframe paper around spatial design argument
</commit_message>
<xml_diff>
--- a/cases/apartment_daytime_cooled/paper_draft.docx
+++ b/cases/apartment_daytime_cooled/paper_draft.docx
@@ -39,7 +39,7 @@
           <w:rFonts w:ascii="Times New Roman" w:hAnsi="Times New Roman"/>
           <w:sz w:val="24"/>
         </w:rPr>
-        <w:t>A single thermostat setpoint applied to one apartment produces substantial thermal comfort variation across rooms and occupant cohorts, with room-level PMV spans ranging from roughly one to nearly four units depending on cohort and setpoint. This paper presents a spatial comfort assessment framework that computes ISO 7730 heat-balance decomposition for individually placed occupant agents across a gridded floor plan, translating anticipated design conditions into occupant-level thermal outcomes. Applied to a 24-room apartment under 120 scenarios (five air temperatures, four humidity levels, six occupant cohorts spanning demographic and behavioral variation), the framework produces 2,520 agent-level records and per-agent JSON snapshots carrying full convective, radiative, evaporative, and respiratory heat-loss breakdowns. In the apartment case, orientation-driven mean radiant temperature offsets shift radiative heat loss by about 5 W/m², while cohort configurations involving clothing and activity shift convective and radiative loss by similar magnitudes. These effects are comparable in order: the architectural plan is not a passive container for thermal conditions but an active participant in the comfort equation. The framework surfaces this hidden spatial intelligence without energy modeling or computational fluid dynamics, operating at the resolution and speed accessible to designers during early design.</w:t>
+        <w:t>Floor plans carry thermal consequences that conventional representations cannot show. A south-facing bedroom occupied by an older resident can produce a fundamentally different thermal experience than a north-facing studio used by a younger desk worker, even under the same setpoint. This paper presents a spatial comfort assessment framework that makes that hidden differentiation legible by distributing individually characterized occupant agents across a gridded floor plan and computing ISO 7730 heat-balance decomposition per agent, turning anticipated design conditions into a population-level thermal field rather than a zone-level average. Applied to a 24-room apartment under 120 scenarios (five air temperatures, four humidity levels, six occupant cohorts spanning demographic and behavioral variation), the framework produces 2,520 agent-level records and per-agent JSON snapshots carrying full convective, radiative, evaporative, and respiratory heat-loss breakdowns. In the apartment case, room-level PMV spans range from roughly one to nearly four units within a single plan under uniform setpoints. A secondary office counterfactual on the same footprint shows that partition topology redistributes discomfort more than it resolves it: open plans preserve perimeter-to-core thermal inequality that cellular layouts suppress through room averaging. Orientation-driven mean radiant temperature offsets shift radiative heat loss by about 5 W/m², while cohort configurations involving clothing and activity shift convective and radiative loss by similar magnitudes. Spatial organization is not a passive container for thermal conditions. It is an active participant in who gets comfortable and who does not.</w:t>
       </w:r>
     </w:p>
     <w:p>
@@ -78,72 +78,72 @@
           <w:rFonts w:ascii="Times New Roman" w:hAnsi="Times New Roman"/>
           <w:sz w:val="24"/>
         </w:rPr>
-        <w:t>Room orientation, plan depth, and adjacency to exterior walls carry thermal consequences that propagate to occupant experience. Standard practice evaluates these consequences at the building level through energy models reporting zone-average temperatures and aggregate loads. The embedded assumption is that comfort within a conditioned zone is uniform: set the thermostat, and the zone is comfortable.</w:t>
-      </w:r>
-    </w:p>
-    <w:p>
-      <w:pPr>
-        <w:spacing w:after="120"/>
-        <w:jc w:val="both"/>
-      </w:pPr>
-      <w:r>
-        <w:rPr>
-          <w:rFonts w:ascii="Times New Roman" w:hAnsi="Times New Roman"/>
-          <w:sz w:val="24"/>
-        </w:rPr>
-        <w:t>This assumption conceals substantial heterogeneity. Under a single 25°C setpoint, mean radiant temperature varies by orientation, air velocity varies by room function, and occupants themselves modulate the thermal balance through their age, body mass, clothing, and activity. A south-facing bedroom occupied by an elderly person in light clothing produces a fundamentally different thermal experience than a north-facing kitchen with a younger person standing and cooking. The plan encodes this differentiation. Conventional tools do not reveal it.</w:t>
-      </w:r>
-    </w:p>
-    <w:p>
-      <w:pPr>
-        <w:spacing w:after="120"/>
-        <w:jc w:val="both"/>
-      </w:pPr>
-      <w:r>
-        <w:rPr>
-          <w:rFonts w:ascii="Times New Roman" w:hAnsi="Times New Roman"/>
-          <w:sz w:val="24"/>
-        </w:rPr>
-        <w:t>This paper presents a framework that translates anticipated design conditions into individual-level heat-balance outcomes across a floor plan. The framework computes ISO 7730 Predicted Mean Vote for each placed occupant agent and decomposes the result into convective, radiative, evaporative, and respiratory heat-loss pathways. Distributing agents across a settled design and sweeping environmental parameters reveals hidden spatial intelligence: thermal comfort patterns latent in the spatial organization but invisible in drawings or zone-level outputs.</w:t>
-      </w:r>
-    </w:p>
-    <w:p>
-      <w:pPr>
-        <w:spacing w:after="120"/>
-        <w:jc w:val="both"/>
-      </w:pPr>
-      <w:r>
-        <w:rPr>
-          <w:rFonts w:ascii="Times New Roman" w:hAnsi="Times New Roman"/>
-          <w:sz w:val="24"/>
-        </w:rPr>
-        <w:t>The underlying data model captures a holistic snapshot of each occupant’s experience: thermal state, lighting, acoustics, spatial context, demographics, and preferences. This paper exercises the thermal channel quantitatively, demonstrating that the agent-level structure supports rigorous heat-balance analysis at the plan scale.</w:t>
-      </w:r>
-    </w:p>
-    <w:p>
-      <w:pPr>
-        <w:spacing w:after="120"/>
-        <w:jc w:val="both"/>
-      </w:pPr>
-      <w:r>
-        <w:rPr>
-          <w:rFonts w:ascii="Times New Roman" w:hAnsi="Times New Roman"/>
-          <w:sz w:val="24"/>
-        </w:rPr>
-        <w:t>The contribution is threefold: (1) a lightweight, deterministic framework linking spatial design to occupant-level thermal decomposition; (2) a 120-scenario apartment case study demonstrating that spatial geometry and body configuration produce comparable magnitudes (~5 W/m²) of heat-transfer heterogeneity; and (3) evidence that floor plans contain recoverable thermal intelligence that zone-level analysis does not surface.</w:t>
-      </w:r>
-    </w:p>
-    <w:p>
-      <w:pPr>
-        <w:spacing w:after="120"/>
-        <w:jc w:val="both"/>
-      </w:pPr>
-      <w:r>
-        <w:rPr>
-          <w:rFonts w:ascii="Times New Roman" w:hAnsi="Times New Roman"/>
-          <w:sz w:val="24"/>
-        </w:rPr>
-        <w:t>To be clear about what this framework does and does not do: it does not optimize a plan. It reveals where a given design becomes population-conditioned and spatially fragile, where comfort outcomes diverge sharply across occupant profiles and room positions. This changes early design judgment about room assignment, orientation, partition placement, glazing specification, and environmental setpoints, because the consequences of those decisions become visible before construction.</w:t>
+        <w:t>Architectural design is always directed toward occupants, yet early environmental reasoning often treats those occupants as generic. Standard workflows reduce a building to conditioned zones and report average temperatures and aggregate loads. The embedded assumption is that if the thermostat is set appropriately, the zone is comfortable and the people inside it are effectively interchangeable.</w:t>
+      </w:r>
+    </w:p>
+    <w:p>
+      <w:pPr>
+        <w:spacing w:after="120"/>
+        <w:jc w:val="both"/>
+      </w:pPr>
+      <w:r>
+        <w:rPr>
+          <w:rFonts w:ascii="Times New Roman" w:hAnsi="Times New Roman"/>
+          <w:sz w:val="24"/>
+        </w:rPr>
+        <w:t>That assumption does not survive contact with an actual floor plan. Under the same 25°C setpoint, mean radiant temperature varies by orientation, air velocity varies by room function, and occupants themselves modulate the thermal balance through their age, body mass, clothing, and activity. A south-facing bedroom occupied by an older resident in light clothing produces a fundamentally different thermal experience than a north-facing kitchen with a younger person standing and cooking. The plan encodes this differentiation. Conventional tools and drawings do not surface it.</w:t>
+      </w:r>
+    </w:p>
+    <w:p>
+      <w:pPr>
+        <w:spacing w:after="120"/>
+        <w:jc w:val="both"/>
+      </w:pPr>
+      <w:r>
+        <w:rPr>
+          <w:rFonts w:ascii="Times New Roman" w:hAnsi="Times New Roman"/>
+          <w:sz w:val="24"/>
+        </w:rPr>
+        <w:t>The gap this creates is not merely technical. It is representational. Architects make decisions about room assignment, partition placement, glazing, and orientation during early design, long before any occupant sets foot in the building. Those decisions carry thermal consequences for specific kinds of people, yet the standard zone-level model collapses those consequences into a single average. The plan communicates spatial intent. It does not communicate who will be comfortable and who will not.</w:t>
+      </w:r>
+    </w:p>
+    <w:p>
+      <w:pPr>
+        <w:spacing w:after="120"/>
+        <w:jc w:val="both"/>
+      </w:pPr>
+      <w:r>
+        <w:rPr>
+          <w:rFonts w:ascii="Times New Roman" w:hAnsi="Times New Roman"/>
+          <w:sz w:val="24"/>
+        </w:rPr>
+        <w:t>This paper presents a framework that closes that representational gap. By distributing individually characterized occupant agents across a gridded floor plan and computing ISO 7730 heat-balance decomposition per agent, the framework translates anticipated design conditions into a population-level thermal field readable at the resolution where design decisions happen. The result is not an optimization dashboard. It is a design-facing analytical drawing that makes the thermal consequences of spatial decisions visible before construction.</w:t>
+      </w:r>
+    </w:p>
+    <w:p>
+      <w:pPr>
+        <w:spacing w:after="120"/>
+        <w:jc w:val="both"/>
+      </w:pPr>
+      <w:r>
+        <w:rPr>
+          <w:rFonts w:ascii="Times New Roman" w:hAnsi="Times New Roman"/>
+          <w:sz w:val="24"/>
+        </w:rPr>
+        <w:t>The framework combines three input layers—spatial geometry, room-level environmental conditions, and individually characterized occupant agents—and produces per-agent JSON snapshots carrying full heat-loss decomposition alongside demographic, spatial, and preference context. Applied to a 24-room apartment under 120 scenarios and extended to an office topology counterfactual on the same footprint, the case study demonstrates that spatial organization and body configuration produce comparable magnitudes of thermal heterogeneity, and that partition topology reshapes the visibility of discomfort more than it resolves the discomfort itself.</w:t>
+      </w:r>
+    </w:p>
+    <w:p>
+      <w:pPr>
+        <w:spacing w:after="120"/>
+        <w:jc w:val="both"/>
+      </w:pPr>
+      <w:r>
+        <w:rPr>
+          <w:rFonts w:ascii="Times New Roman" w:hAnsi="Times New Roman"/>
+          <w:sz w:val="24"/>
+        </w:rPr>
+        <w:t>The contribution is not a new dynamic simulation method. It is a lightweight, deterministic representational instrument for early design: one that reveals where a given plan becomes population-conditioned and spatially fragile, where comfort outcomes diverge sharply across occupant profiles and room positions, and where room assignment, orientation, partition placement, glazing specification, and environmental setpoints carry consequences that conventional zone-level analysis does not show.</w:t>
       </w:r>
     </w:p>
     <w:p>
@@ -883,7 +883,7 @@
           <w:rFonts w:ascii="Times New Roman" w:hAnsi="Times New Roman"/>
           <w:sz w:val="24"/>
         </w:rPr>
-        <w:t>Figure 7 plots convective against radiative heat loss for each room in three cohorts at 25°C. Color encodes cohort; marker shape encodes solar exposure. A diagonal reference marks equal convective and radiative loss.</w:t>
+        <w:t>The heat-balance decomposition makes it possible to ask a design question that conventional comfort analysis usually hides: does the spatial organization of a plan matter as much as the people inside it? Figure 7 plots convective against radiative heat loss for each room in three cohorts at 25°C. Color encodes cohort; marker shape encodes solar exposure. A diagonal reference marks equal convective and radiative loss.</w:t>
       </w:r>
     </w:p>
     <w:p>
@@ -1051,20 +1051,20 @@
           <w:rFonts w:ascii="Times New Roman" w:hAnsi="Times New Roman"/>
           <w:sz w:val="24"/>
         </w:rPr>
-        <w:t>Within these limitations, the framework supports design interventions beyond those exercised in this case study. Modifying wall partitions changes room geometry and zone assignment. Increasing glazing area or changing facade type alters the mean radiant temperature assigned to affected rooms. Adjusting mechanical ventilation changes per-room air velocity. Each intervention propagates instantly through the heat-balance engine, enabling real-time comparison of comfort outcomes across plan variants.</w:t>
-      </w:r>
-    </w:p>
-    <w:p>
-      <w:pPr>
-        <w:spacing w:after="120"/>
-        <w:jc w:val="both"/>
-      </w:pPr>
-      <w:r>
-        <w:rPr>
-          <w:rFonts w:ascii="Times New Roman" w:hAnsi="Times New Roman"/>
-          <w:sz w:val="24"/>
-        </w:rPr>
-        <w:t>A secondary office counterfactual on the same footprint sharpens this point. When the apartment envelope is reinterpreted as either a cellular office or an open-plan office under a cool-humid 22°C / 80% RH condition, mean PMV remains nearly unchanged for several cohorts while the spatial field stretches substantially. For a realistic mixed office cohort, interpolated work-cell PMV range increases from 0.216 in the cellular layout to 0.662 in the open layout; for a default 35-year-old male baseline, the same range increases from 0.179 to 0.529; for a realistic male cohort, from 0.182 to 0.537; and for a lighter-clothed female cohort, from 0.245 to 0.772. The open plan does not necessarily improve mean comfort. It makes perimeter-to-core thermal inequality more spatially legible, whereas the cellular plan suppresses that inequality through room averaging.</w:t>
+        <w:t>Within these limitations, the framework supports the kind of iterative judgment that characterizes early design. Modifying wall partitions changes room geometry and zone assignment. Increasing glazing area or changing facade type alters the mean radiant temperature assigned to affected rooms. Adjusting mechanical ventilation changes per-room air velocity. Each intervention propagates instantly through the heat-balance engine, enabling direct comparison of comfort outcomes across plan variants.</w:t>
+      </w:r>
+    </w:p>
+    <w:p>
+      <w:pPr>
+        <w:spacing w:after="120"/>
+        <w:jc w:val="both"/>
+      </w:pPr>
+      <w:r>
+        <w:rPr>
+          <w:rFonts w:ascii="Times New Roman" w:hAnsi="Times New Roman"/>
+          <w:sz w:val="24"/>
+        </w:rPr>
+        <w:t>The office counterfactual suggests that topology can redistribute the visibility of discomfort even when it does not materially improve mean comfort (Figure 8). When the same envelope is reinterpreted as either a cellular office or an open-plan office under a cool-humid 22°C / 80% RH condition, the cohort means remain nearly unchanged while the spatial field stretches substantially. For a realistic mixed office cohort, interpolated work-cell PMV range increases from 0.216 in the cellular layout to 0.662 in the open layout; for a default 35-year-old male baseline, from 0.179 to 0.529; for a realistic male cohort, from 0.182 to 0.537; and for a lighter-clothed female cohort, from 0.245 to 0.772. The open plan does not necessarily solve the comfort problem. It makes perimeter-to-core thermal inequality more spatially legible, whereas the cellular plan suppresses that same inequality through room averaging.</w:t>
       </w:r>
     </w:p>
     <w:p>
@@ -1082,6 +1082,59 @@
     </w:p>
     <w:p>
       <w:pPr>
+        <w:spacing w:before="120" w:after="60"/>
+        <w:jc w:val="center"/>
+      </w:pPr>
+      <w:r>
+        <w:drawing>
+          <wp:inline xmlns:a="http://schemas.openxmlformats.org/drawingml/2006/main" xmlns:pic="http://schemas.openxmlformats.org/drawingml/2006/picture">
+            <wp:extent cx="5943600" cy="2503330"/>
+            <wp:docPr id="8" name="Picture 8"/>
+            <wp:cNvGraphicFramePr>
+              <a:graphicFrameLocks noChangeAspect="1"/>
+            </wp:cNvGraphicFramePr>
+            <a:graphic>
+              <a:graphicData uri="http://schemas.openxmlformats.org/drawingml/2006/picture">
+                <pic:pic>
+                  <pic:nvPicPr>
+                    <pic:cNvPr id="0" name="fig_office_topology_story_hires.png"/>
+                    <pic:cNvPicPr/>
+                  </pic:nvPicPr>
+                  <pic:blipFill>
+                    <a:blip r:embed="rId27"/>
+                    <a:stretch>
+                      <a:fillRect/>
+                    </a:stretch>
+                  </pic:blipFill>
+                  <pic:spPr>
+                    <a:xfrm>
+                      <a:off x="0" y="0"/>
+                      <a:ext cx="5943600" cy="2503330"/>
+                    </a:xfrm>
+                    <a:prstGeom prst="rect"/>
+                  </pic:spPr>
+                </pic:pic>
+              </a:graphicData>
+            </a:graphic>
+          </wp:inline>
+        </w:drawing>
+      </w:r>
+    </w:p>
+    <w:p>
+      <w:pPr>
+        <w:spacing w:after="240"/>
+      </w:pPr>
+      <w:r>
+        <w:rPr>
+          <w:rFonts w:ascii="Times New Roman" w:hAnsi="Times New Roman"/>
+          <w:i/>
+          <w:sz w:val="20"/>
+        </w:rPr>
+        <w:t>Figure 8.  Office topology counterfactual on the shared footprint at 22°C / 80% RH. Columns compare three cohorts; rows compare the same plan interpreted as a cellular office and as an open office. Cell color encodes mean cohort PMV at work cells. Default-male workers remain least cold, while mixed and female-light cohorts shift colder; opening the plan leaves cohort means nearly unchanged but stretches the spatial field and makes the perimeter-to-core gradient visibly continuous.</w:t>
+      </w:r>
+    </w:p>
+    <w:p>
+      <w:pPr>
         <w:spacing w:before="120" w:after="120"/>
       </w:pPr>
       <w:r>
@@ -1103,46 +1156,46 @@
           <w:rFonts w:ascii="Times New Roman" w:hAnsi="Times New Roman"/>
           <w:sz w:val="24"/>
         </w:rPr>
-        <w:t>This paper presented a spatial thermal comfort assessment framework that computes occupant-level heat-balance decomposition from anticipated design conditions across a floor plan. Applied to a 24-room apartment under 120 scenarios, the framework reveals persistent comfort heterogeneity ranging from roughly one to nearly four PMV units within a single plan under uniform setpoints—a hidden spatial intelligence that is encoded in the plan’s geometry and environmental differentiation but invisible in conventional representations.</w:t>
-      </w:r>
-    </w:p>
-    <w:p>
-      <w:pPr>
-        <w:spacing w:after="120"/>
-        <w:jc w:val="both"/>
-      </w:pPr>
-      <w:r>
-        <w:rPr>
-          <w:rFonts w:ascii="Times New Roman" w:hAnsi="Times New Roman"/>
-          <w:sz w:val="24"/>
-        </w:rPr>
-        <w:t>The heat-balance decomposition provides the mechanism behind the heterogeneity. Spatial factors—primarily orientation-driven mean radiant temperature gradients—and body-configuration factors—in this case most visibly clothing and activity configuration—shift heat loss by comparable magnitudes on the order of five watts per square meter. These comparable magnitudes suggest that the architectural plan is not a passive container for thermal conditions but an active instrument whose spatial decisions carry thermal consequences on the same order as the occupant variables that designers do not typically control.</w:t>
-      </w:r>
-    </w:p>
-    <w:p>
-      <w:pPr>
-        <w:spacing w:after="120"/>
-        <w:jc w:val="both"/>
-      </w:pPr>
-      <w:r>
-        <w:rPr>
-          <w:rFonts w:ascii="Times New Roman" w:hAnsi="Times New Roman"/>
-          <w:sz w:val="24"/>
-        </w:rPr>
-        <w:t>The secondary office counterfactual extends this claim from residential partitioning to workplace topology. Reusing the same footprint as either a cellular or open office shows that topology shifts the visibility and distribution of discomfort more than the mean thermal state: open plans preserve broader perimeter-to-core gradients, while cellular layouts flatten those same gradients into room-level averages.</w:t>
-      </w:r>
-    </w:p>
-    <w:p>
-      <w:pPr>
-        <w:spacing w:after="120"/>
-        <w:jc w:val="both"/>
-      </w:pPr>
-      <w:r>
-        <w:rPr>
-          <w:rFonts w:ascii="Times New Roman" w:hAnsi="Times New Roman"/>
-          <w:sz w:val="24"/>
-        </w:rPr>
-        <w:t>By making spatial thermal intelligence visible and quantifiable at the plan level, without requiring energy simulation or computational fluid dynamics, the framework supports informed design decisions about room layout, orientation, partition placement, glazing, and environmental specification before physical construction. The holistic data model, which already carries lighting, acoustic, and preference fields alongside the thermal channel exercised here, positions this work for extension to multi-channel environmental quality assessment at the same spatial resolution.</w:t>
+        <w:t>Much thermal analysis still implies a generic occupant and a generic zone. This paper argues that those abstractions hide the consequences of spatial decisions for different bodies in different rooms. By distributing individually characterized agents across a floor plan, the framework makes hidden thermal intelligence legible before construction.</w:t>
+      </w:r>
+    </w:p>
+    <w:p>
+      <w:pPr>
+        <w:spacing w:after="120"/>
+        <w:jc w:val="both"/>
+      </w:pPr>
+      <w:r>
+        <w:rPr>
+          <w:rFonts w:ascii="Times New Roman" w:hAnsi="Times New Roman"/>
+          <w:sz w:val="24"/>
+        </w:rPr>
+        <w:t>In the 24-room apartment case, that hidden intelligence appears as persistent comfort heterogeneity ranging from roughly one to nearly four PMV units within a single plan under uniform setpoints. The heat-balance decomposition shows why. Spatial factors—primarily orientation-driven mean radiant temperature gradients—and body-configuration factors—most visibly clothing and activity configuration in this study—shift heat loss by comparable magnitudes on the order of five watts per square meter. The architectural plan is therefore not a passive container for thermal conditions. Its spatial decisions carry thermal consequences on the same order as occupant variables designers do not typically control.</w:t>
+      </w:r>
+    </w:p>
+    <w:p>
+      <w:pPr>
+        <w:spacing w:after="120"/>
+        <w:jc w:val="both"/>
+      </w:pPr>
+      <w:r>
+        <w:rPr>
+          <w:rFonts w:ascii="Times New Roman" w:hAnsi="Times New Roman"/>
+          <w:sz w:val="24"/>
+        </w:rPr>
+        <w:t>The office counterfactual sharpens this claim. Reusing the same footprint as a cellular or open office does not produce dramatically different mean comfort; at 22°C, many occupants remain cold in both layouts. What changes is the distribution and visibility of discomfort. Open topology stretches the perimeter-to-core gradient into a legible spatial field, while cellular topology collapses that same gradient back into room averages.</w:t>
+      </w:r>
+    </w:p>
+    <w:p>
+      <w:pPr>
+        <w:spacing w:after="120"/>
+        <w:jc w:val="both"/>
+      </w:pPr>
+      <w:r>
+        <w:rPr>
+          <w:rFonts w:ascii="Times New Roman" w:hAnsi="Times New Roman"/>
+          <w:sz w:val="24"/>
+        </w:rPr>
+        <w:t>What the framework ultimately offers is not another optimization target but a new kind of design feedback: the ability to see, before a building is built, which occupants a given spatial configuration advantages, which it penalizes, and why. The holistic data model already carries lighting, acoustic, and preference fields alongside the thermal channel exercised here, positioning the framework for extension to multi-channel environmental quality assessment at the same spatial resolution.</w:t>
       </w:r>
     </w:p>
     <w:p>
@@ -1342,9 +1395,9 @@
     </w:p>
     <w:sectPr>
       <w:footerReference w:type="default" r:id="rId16"/>
-      <w:headerReference w:type="default" r:id="rId27"/>
-      <w:headerReference w:type="first" r:id="rId28"/>
-      <w:footerReference w:type="first" r:id="rId29"/>
+      <w:headerReference w:type="default" r:id="rId28"/>
+      <w:headerReference w:type="first" r:id="rId29"/>
+      <w:footerReference w:type="first" r:id="rId30"/>
       <w:pgSz w:w="12240" w:h="15840"/>
       <w:pgMar w:top="1440" w:right="1440" w:bottom="1440" w:left="1440" w:header="720" w:footer="1440" w:gutter="0"/>
       <w:pgNumType w:start="1"/>

</xml_diff>

<commit_message>
Replace office Figure 8 with spatial field maps
</commit_message>
<xml_diff>
--- a/cases/apartment_daytime_cooled/paper_draft.docx
+++ b/cases/apartment_daytime_cooled/paper_draft.docx
@@ -1088,7 +1088,7 @@
       <w:r>
         <w:drawing>
           <wp:inline xmlns:a="http://schemas.openxmlformats.org/drawingml/2006/main" xmlns:pic="http://schemas.openxmlformats.org/drawingml/2006/picture">
-            <wp:extent cx="5943600" cy="2503330"/>
+            <wp:extent cx="5943600" cy="4413118"/>
             <wp:docPr id="8" name="Picture 8"/>
             <wp:cNvGraphicFramePr>
               <a:graphicFrameLocks noChangeAspect="1"/>
@@ -1109,7 +1109,7 @@
                   <pic:spPr>
                     <a:xfrm>
                       <a:off x="0" y="0"/>
-                      <a:ext cx="5943600" cy="2503330"/>
+                      <a:ext cx="5943600" cy="4413118"/>
                     </a:xfrm>
                     <a:prstGeom prst="rect"/>
                   </pic:spPr>
@@ -1130,7 +1130,7 @@
           <w:i/>
           <w:sz w:val="20"/>
         </w:rPr>
-        <w:t>Figure 8.  Office topology counterfactual on the shared footprint at 22°C / 80% RH. Columns compare three cohorts; rows compare the same plan interpreted as a cellular office and as an open office. Cell color encodes mean cohort PMV at work cells. Default-male workers remain least cold, while mixed and female-light cohorts shift colder; opening the plan leaves cohort means nearly unchanged but stretches the spatial field and makes the perimeter-to-core gradient visibly continuous.</w:t>
+        <w:t>Figure 8.  Office topology counterfactual on the shared footprint at 22°C / 80% RH. Columns compare three cohorts; rows compare the same plan interpreted as a cellular office and as an open office. Color encodes interpolated PMV across occupied work areas, while support rooms remain muted; panel chips report mean PMV, mean PPD, and interpolated field span. Default-male workers remain least cold, while mixed and female-light cohorts shift colder; opening the plan leaves cohort means nearly unchanged but stretches the spatial field and makes the perimeter-to-core gradient visibly continuous.</w:t>
       </w:r>
     </w:p>
     <w:p>

</xml_diff>

<commit_message>
Upgrade office Figure 8 and narrative
</commit_message>
<xml_diff>
--- a/cases/apartment_daytime_cooled/paper_draft.docx
+++ b/cases/apartment_daytime_cooled/paper_draft.docx
@@ -39,7 +39,7 @@
           <w:rFonts w:ascii="Times New Roman" w:hAnsi="Times New Roman"/>
           <w:sz w:val="24"/>
         </w:rPr>
-        <w:t>Floor plans carry thermal consequences that conventional representations cannot show. A south-facing bedroom occupied by an older resident can produce a fundamentally different thermal experience than a north-facing studio used by a younger desk worker, even under the same setpoint. This paper presents a spatial comfort assessment framework that makes that hidden differentiation legible by distributing individually characterized occupant agents across a gridded floor plan and computing ISO 7730 heat-balance decomposition per agent, turning anticipated design conditions into a population-level thermal field rather than a zone-level average. Applied to a 24-room apartment under 120 scenarios (five air temperatures, four humidity levels, six occupant cohorts spanning demographic and behavioral variation), the framework produces 2,520 agent-level records and per-agent JSON snapshots carrying full convective, radiative, evaporative, and respiratory heat-loss breakdowns. In the apartment case, room-level PMV spans range from roughly one to nearly four units within a single plan under uniform setpoints. A secondary office counterfactual on the same footprint shows that partition topology redistributes discomfort more than it resolves it: open plans preserve perimeter-to-core thermal inequality that cellular layouts suppress through room averaging. Orientation-driven mean radiant temperature offsets shift radiative heat loss by about 5 W/m², while cohort configurations involving clothing and activity shift convective and radiative loss by similar magnitudes. Spatial organization is not a passive container for thermal conditions. It is an active participant in who gets comfortable and who does not.</w:t>
+        <w:t>Floor plans carry thermal consequences that conventional representations cannot show. A south-facing bedroom occupied by an older resident can produce a fundamentally different thermal experience than a north-facing studio used by a younger desk worker, even under the same setpoint. This paper presents a spatial comfort assessment framework that makes that hidden differentiation legible by distributing individually characterized occupant agents across a gridded floor plan and computing ISO 7730 heat-balance decomposition per agent, turning anticipated design conditions into a population-level thermal field rather than a zone-level average. Applied to a 24-room apartment under 120 scenarios (five air temperatures, four humidity levels, six occupant cohorts spanning demographic and behavioral variation), the framework produces 2,520 agent-level records and per-agent JSON snapshots carrying full convective, radiative, evaporative, and respiratory heat-loss breakdowns. In the apartment case, room-level PMV spans range from roughly one to nearly four units within a single plan under uniform setpoints. A secondary office counterfactual on the same footprint shows that partition topology does not neutralize discomfort so much as redistribute it: at 22°C / 80% RH, the open-office interpretation widens work-cell PMV spread for every cohort while leaving mean sensation nearly unchanged and, for most cohorts, slightly colder than the cellular layout. Orientation-driven mean radiant temperature offsets shift radiative heat loss by about 5 W/m², while cohort configurations involving clothing and activity shift convective and radiative loss by similar magnitudes. Spatial organization is not a passive container for thermal conditions. It is an active participant in who gets comfortable and who does not.</w:t>
       </w:r>
     </w:p>
     <w:p>
@@ -130,7 +130,7 @@
           <w:rFonts w:ascii="Times New Roman" w:hAnsi="Times New Roman"/>
           <w:sz w:val="24"/>
         </w:rPr>
-        <w:t>The framework combines three input layers—spatial geometry, room-level environmental conditions, and individually characterized occupant agents—and produces per-agent JSON snapshots carrying full heat-loss decomposition alongside demographic, spatial, and preference context. Applied to a 24-room apartment under 120 scenarios and extended to an office topology counterfactual on the same footprint, the case study demonstrates that spatial organization and body configuration produce comparable magnitudes of thermal heterogeneity, and that partition topology reshapes the visibility of discomfort more than it resolves the discomfort itself.</w:t>
+        <w:t>The framework combines three input layers—spatial geometry, room-level environmental conditions, and individually characterized occupant agents—and produces per-agent JSON snapshots carrying full heat-loss decomposition alongside demographic, spatial, and preference context. Applied to a 24-room apartment under 120 scenarios and extended to an office topology counterfactual on the same footprint, the case study demonstrates that spatial organization and body configuration produce comparable magnitudes of thermal heterogeneity, and that partition topology widens and clarifies perimeter-to-core inequality more than it resolves the discomfort itself.</w:t>
       </w:r>
     </w:p>
     <w:p>
@@ -1064,7 +1064,7 @@
           <w:rFonts w:ascii="Times New Roman" w:hAnsi="Times New Roman"/>
           <w:sz w:val="24"/>
         </w:rPr>
-        <w:t>The office counterfactual suggests that topology can redistribute the visibility of discomfort even when it does not materially improve mean comfort (Figure 8). When the same envelope is reinterpreted as either a cellular office or an open-plan office under a cool-humid 22°C / 80% RH condition, the cohort means remain nearly unchanged while the spatial field stretches substantially. For a realistic mixed office cohort, interpolated work-cell PMV range increases from 0.216 in the cellular layout to 0.662 in the open layout; for a default 35-year-old male baseline, from 0.179 to 0.529; for a realistic male cohort, from 0.182 to 0.537; and for a lighter-clothed female cohort, from 0.245 to 0.772. The open plan does not necessarily solve the comfort problem. It makes perimeter-to-core thermal inequality more spatially legible, whereas the cellular plan suppresses that same inequality through room averaging.</w:t>
+        <w:t>The office counterfactual suggests that topology can redistribute and sometimes deepen cold-side discomfort even when it does not materially improve mean comfort (Figure 8). When the same envelope is reinterpreted as either a cellular office or an open-plan office under a cool-humid 22°C / 80% RH condition, the cohort means shift only marginally, with three of the four compared cohorts moving slightly colder, while the work-cell field stretches substantially. For a realistic mixed office cohort, interpolated work-cell PMV range increases from 0.216 in the cellular layout to 0.662 in the open layout; for a default 35-year-old male baseline, from 0.179 to 0.529; for a realistic male cohort, from 0.182 to 0.537; and for a lighter-clothed female cohort, from 0.245 to 0.772. The design intelligence here is not that open plans solve the comfort problem. It is that topology determines whether perimeter-to-core inequality is averaged away into rooms or exposed as a continuous field that can be read, assigned, and redesigned.</w:t>
       </w:r>
     </w:p>
     <w:p>
@@ -1088,7 +1088,7 @@
       <w:r>
         <w:drawing>
           <wp:inline xmlns:a="http://schemas.openxmlformats.org/drawingml/2006/main" xmlns:pic="http://schemas.openxmlformats.org/drawingml/2006/picture">
-            <wp:extent cx="5943600" cy="4413118"/>
+            <wp:extent cx="5943600" cy="3102888"/>
             <wp:docPr id="8" name="Picture 8"/>
             <wp:cNvGraphicFramePr>
               <a:graphicFrameLocks noChangeAspect="1"/>
@@ -1097,7 +1097,7 @@
               <a:graphicData uri="http://schemas.openxmlformats.org/drawingml/2006/picture">
                 <pic:pic>
                   <pic:nvPicPr>
-                    <pic:cNvPr id="0" name="fig_office_topology_story_hires.png"/>
+                    <pic:cNvPr id="0" name="fig_office_topology_story_with_box_sidecar_hires.png"/>
                     <pic:cNvPicPr/>
                   </pic:nvPicPr>
                   <pic:blipFill>
@@ -1109,7 +1109,7 @@
                   <pic:spPr>
                     <a:xfrm>
                       <a:off x="0" y="0"/>
-                      <a:ext cx="5943600" cy="4413118"/>
+                      <a:ext cx="5943600" cy="3102888"/>
                     </a:xfrm>
                     <a:prstGeom prst="rect"/>
                   </pic:spPr>
@@ -1130,7 +1130,7 @@
           <w:i/>
           <w:sz w:val="20"/>
         </w:rPr>
-        <w:t>Figure 8.  Office topology counterfactual on the shared footprint at 22°C / 80% RH. Columns compare three cohorts; rows compare the same plan interpreted as a cellular office and as an open office. Color encodes interpolated PMV across occupied work areas, while support rooms remain muted; panel chips report mean PMV, mean PPD, and interpolated field span. Default-male workers remain least cold, while mixed and female-light cohorts shift colder; opening the plan leaves cohort means nearly unchanged but stretches the spatial field and makes the perimeter-to-core gradient visibly continuous.</w:t>
+        <w:t>Figure 8.  Office topology counterfactual on the shared footprint at 22°C / 80% RH. Left: the same footprint rendered as a cellular office and as an open office for three representative cohorts; color encodes interpolated PMV across occupied work areas, while support rooms remain muted. Right: paired boxplots show actual work-cell PMV distributions for four cohorts on a shared axis (graphite = cellular, moss = open). The open-plan version widens PMV spread for every cohort and typically nudges sensation colder, making perimeter-to-core thermal inequality more legible rather than eliminating it.</w:t>
       </w:r>
     </w:p>
     <w:p>
@@ -1182,7 +1182,7 @@
           <w:rFonts w:ascii="Times New Roman" w:hAnsi="Times New Roman"/>
           <w:sz w:val="24"/>
         </w:rPr>
-        <w:t>The office counterfactual sharpens this claim. Reusing the same footprint as a cellular or open office does not produce dramatically different mean comfort; at 22°C, many occupants remain cold in both layouts. What changes is the distribution and visibility of discomfort. Open topology stretches the perimeter-to-core gradient into a legible spatial field, while cellular topology collapses that same gradient back into room averages.</w:t>
+        <w:t>The office counterfactual sharpens this claim. Reusing the same footprint as a cellular or open office does not improve comfort simply by removing partitions; at 22°C, many occupants remain cold in both layouts. Open plan slightly worsens mean sensation for most cohorts and widens work-cell spread for all of them. What changes most is the distribution and legibility of discomfort. Open topology stretches the perimeter-to-core gradient into a continuous field, while cellular topology collapses that same gradient back into room averages.</w:t>
       </w:r>
     </w:p>
     <w:p>

</xml_diff>